<commit_message>
Remove coordinators from MoU and update museum phone number
Drop the coordinator article, contact row and annex activity; the
Joint Working Group remains as Article 5. Museum phone is now
+998 70 523 10 10. Contacts table is kept on a single page.

Co-Authored-By: Claude Opus 5.5 <noreply@anthropic.com>
Claude-Session: https://claude.ai/code/session_01Lu4QoaDikGyrPsvsHy5NF8
</commit_message>
<xml_diff>
--- a/memorandum/MoU_Tashkent_Polytechnic_Museum_Panshi_DRAFT.docx
+++ b/memorandum/MoU_Tashkent_Polytechnic_Museum_Panshi_DRAFT.docx
@@ -907,7 +907,7 @@
           <w:sz w:val="22"/>
           <w:szCs w:val="22"/>
         </w:rPr>
-        <w:t xml:space="preserve">ARTICLE 5. COORDINATION</w:t>
+        <w:t xml:space="preserve">ARTICLE 5. JOINT WORKING GROUP</w:t>
       </w:r>
     </w:p>
     <w:p>
@@ -920,21 +920,6 @@
       </w:pPr>
       <w:r>
         <w:t xml:space="preserve">5.1	</w:t>
-      </w:r>
-      <w:r>
-        <w:t xml:space="preserve">Within thirty (30) days after the signing of this MoU, each Party shall designate a coordinator responsible for its implementation and notify the other Party in writing.</w:t>
-      </w:r>
-    </w:p>
-    <w:p>
-      <w:pPr>
-        <w:tabs>
-          <w:tab w:val="left" w:pos="709"/>
-        </w:tabs>
-        <w:ind w:left="709" w:hanging="709"/>
-        <w:jc w:val="both"/>
-      </w:pPr>
-      <w:r>
-        <w:t xml:space="preserve">5.2	</w:t>
       </w:r>
       <w:r>
         <w:t xml:space="preserve">The Parties may establish a Joint Working Group, which shall meet at least once a year, in person or online, to review progress and agree on an annual plan of activities.</w:t>
@@ -1471,6 +1456,7 @@
           </w:tcPr>
           <w:p>
             <w:pPr>
+              <w:keepNext/>
               <w:spacing w:after="0" w:line="252"/>
             </w:pPr>
           </w:p>
@@ -1495,6 +1481,7 @@
           </w:tcPr>
           <w:p>
             <w:pPr>
+              <w:keepNext/>
               <w:spacing w:after="0" w:line="252"/>
             </w:pPr>
             <w:r>
@@ -1527,6 +1514,7 @@
           </w:tcPr>
           <w:p>
             <w:pPr>
+              <w:keepNext/>
               <w:spacing w:after="0" w:line="252"/>
             </w:pPr>
             <w:r>
@@ -1563,6 +1551,7 @@
           </w:tcPr>
           <w:p>
             <w:pPr>
+              <w:keepNext/>
               <w:spacing w:after="0" w:line="252"/>
             </w:pPr>
             <w:r>
@@ -1593,6 +1582,7 @@
           </w:tcPr>
           <w:p>
             <w:pPr>
+              <w:keepNext/>
               <w:spacing w:after="0" w:line="252"/>
             </w:pPr>
             <w:r>
@@ -1619,6 +1609,7 @@
           </w:tcPr>
           <w:p>
             <w:pPr>
+              <w:keepNext/>
               <w:spacing w:after="0" w:line="252"/>
             </w:pPr>
             <w:r>
@@ -1651,6 +1642,7 @@
           </w:tcPr>
           <w:p>
             <w:pPr>
+              <w:keepNext/>
               <w:spacing w:after="0" w:line="252"/>
             </w:pPr>
             <w:r>
@@ -1658,7 +1650,7 @@
                 <w:b/>
                 <w:bCs/>
               </w:rPr>
-              <w:t xml:space="preserve">Coordinator</w:t>
+              <w:t xml:space="preserve">Telephone</w:t>
             </w:r>
           </w:p>
         </w:tc>
@@ -1682,13 +1674,11 @@
           </w:tcPr>
           <w:p>
             <w:pPr>
-              <w:spacing w:after="0" w:line="252"/>
-            </w:pPr>
-            <w:r>
-              <w:rPr>
-                <w:highlight w:val="yellow"/>
-              </w:rPr>
-              <w:t xml:space="preserve">[full name, position]</w:t>
+              <w:keepNext/>
+              <w:spacing w:after="0" w:line="252"/>
+            </w:pPr>
+            <w:r>
+              <w:t xml:space="preserve">+998 70 523 10 10</w:t>
             </w:r>
           </w:p>
         </w:tc>
@@ -1712,13 +1702,11 @@
           </w:tcPr>
           <w:p>
             <w:pPr>
-              <w:spacing w:after="0" w:line="252"/>
-            </w:pPr>
-            <w:r>
-              <w:rPr>
-                <w:highlight w:val="yellow"/>
-              </w:rPr>
-              <w:t xml:space="preserve">[full name, position]</w:t>
+              <w:keepNext/>
+              <w:spacing w:after="0" w:line="252"/>
+            </w:pPr>
+            <w:r>
+              <w:t xml:space="preserve">+86 400-135-1080</w:t>
             </w:r>
           </w:p>
         </w:tc>
@@ -1746,6 +1734,7 @@
           </w:tcPr>
           <w:p>
             <w:pPr>
+              <w:keepNext/>
               <w:spacing w:after="0" w:line="252"/>
             </w:pPr>
             <w:r>
@@ -1753,7 +1742,7 @@
                 <w:b/>
                 <w:bCs/>
               </w:rPr>
-              <w:t xml:space="preserve">Telephone</w:t>
+              <w:t xml:space="preserve">E-mail</w:t>
             </w:r>
           </w:p>
         </w:tc>
@@ -1776,10 +1765,14 @@
           </w:tcPr>
           <w:p>
             <w:pPr>
-              <w:spacing w:after="0" w:line="252"/>
-            </w:pPr>
-            <w:r>
-              <w:t xml:space="preserve">+998 71 232 34 30</w:t>
+              <w:keepNext/>
+              <w:spacing w:after="0" w:line="252"/>
+            </w:pPr>
+            <w:r>
+              <w:rPr>
+                <w:highlight w:val="yellow"/>
+              </w:rPr>
+              <w:t xml:space="preserve">[e-mail]</w:t>
             </w:r>
           </w:p>
         </w:tc>
@@ -1802,10 +1795,14 @@
           </w:tcPr>
           <w:p>
             <w:pPr>
-              <w:spacing w:after="0" w:line="252"/>
-            </w:pPr>
-            <w:r>
-              <w:t xml:space="preserve">+86 400-135-1080</w:t>
+              <w:keepNext/>
+              <w:spacing w:after="0" w:line="252"/>
+            </w:pPr>
+            <w:r>
+              <w:rPr>
+                <w:highlight w:val="yellow"/>
+              </w:rPr>
+              <w:t xml:space="preserve">[e-mail]</w:t>
             </w:r>
           </w:p>
         </w:tc>
@@ -1834,101 +1831,7 @@
           </w:tcPr>
           <w:p>
             <w:pPr>
-              <w:spacing w:after="0" w:line="252"/>
-            </w:pPr>
-            <w:r>
-              <w:rPr>
-                <w:b/>
-                <w:bCs/>
-              </w:rPr>
-              <w:t xml:space="preserve">E-mail</w:t>
-            </w:r>
-          </w:p>
-        </w:tc>
-        <w:tc>
-          <w:tcPr>
-            <w:tcW w:type="dxa" w:w="3535"/>
-            <w:tcBorders>
-              <w:top w:val="single" w:color="A6A6A6" w:sz="4"/>
-              <w:left w:val="single" w:color="A6A6A6" w:sz="4"/>
-              <w:bottom w:val="single" w:color="A6A6A6" w:sz="4"/>
-              <w:right w:val="single" w:color="A6A6A6" w:sz="4"/>
-            </w:tcBorders>
-            <w:shd w:fill="F2F4F8" w:color="auto" w:val="clear"/>
-            <w:tcMar>
-              <w:top w:type="dxa" w:w="60"/>
-              <w:left w:type="dxa" w:w="110"/>
-              <w:bottom w:type="dxa" w:w="60"/>
-              <w:right w:type="dxa" w:w="110"/>
-            </w:tcMar>
-            <w:vAlign w:val="center"/>
-          </w:tcPr>
-          <w:p>
-            <w:pPr>
-              <w:spacing w:after="0" w:line="252"/>
-            </w:pPr>
-            <w:r>
-              <w:rPr>
-                <w:highlight w:val="yellow"/>
-              </w:rPr>
-              <w:t xml:space="preserve">[e-mail]</w:t>
-            </w:r>
-          </w:p>
-        </w:tc>
-        <w:tc>
-          <w:tcPr>
-            <w:tcW w:type="dxa" w:w="3535"/>
-            <w:tcBorders>
-              <w:top w:val="single" w:color="A6A6A6" w:sz="4"/>
-              <w:left w:val="single" w:color="A6A6A6" w:sz="4"/>
-              <w:bottom w:val="single" w:color="A6A6A6" w:sz="4"/>
-              <w:right w:val="single" w:color="A6A6A6" w:sz="4"/>
-            </w:tcBorders>
-            <w:shd w:fill="F2F4F8" w:color="auto" w:val="clear"/>
-            <w:tcMar>
-              <w:top w:type="dxa" w:w="60"/>
-              <w:left w:type="dxa" w:w="110"/>
-              <w:bottom w:type="dxa" w:w="60"/>
-              <w:right w:type="dxa" w:w="110"/>
-            </w:tcMar>
-            <w:vAlign w:val="center"/>
-          </w:tcPr>
-          <w:p>
-            <w:pPr>
-              <w:spacing w:after="0" w:line="252"/>
-            </w:pPr>
-            <w:r>
-              <w:rPr>
-                <w:highlight w:val="yellow"/>
-              </w:rPr>
-              <w:t xml:space="preserve">[e-mail]</w:t>
-            </w:r>
-          </w:p>
-        </w:tc>
-      </w:tr>
-      <w:tr>
-        <w:trPr>
-          <w:cantSplit/>
-        </w:trPr>
-        <w:tc>
-          <w:tcPr>
-            <w:tcW w:type="dxa" w:w="2000"/>
-            <w:tcBorders>
-              <w:top w:val="single" w:color="A6A6A6" w:sz="4"/>
-              <w:left w:val="single" w:color="A6A6A6" w:sz="4"/>
-              <w:bottom w:val="single" w:color="A6A6A6" w:sz="4"/>
-              <w:right w:val="single" w:color="A6A6A6" w:sz="4"/>
-            </w:tcBorders>
-            <w:tcMar>
-              <w:top w:type="dxa" w:w="60"/>
-              <w:left w:type="dxa" w:w="110"/>
-              <w:bottom w:type="dxa" w:w="60"/>
-              <w:right w:type="dxa" w:w="110"/>
-            </w:tcMar>
-            <w:vAlign w:val="center"/>
-          </w:tcPr>
-          <w:p>
-            <w:pPr>
+              <w:keepNext w:val="false"/>
               <w:spacing w:after="0" w:line="252"/>
             </w:pPr>
             <w:r>
@@ -1949,16 +1852,18 @@
               <w:bottom w:val="single" w:color="A6A6A6" w:sz="4"/>
               <w:right w:val="single" w:color="A6A6A6" w:sz="4"/>
             </w:tcBorders>
-            <w:tcMar>
-              <w:top w:type="dxa" w:w="60"/>
-              <w:left w:type="dxa" w:w="110"/>
-              <w:bottom w:type="dxa" w:w="60"/>
-              <w:right w:type="dxa" w:w="110"/>
-            </w:tcMar>
-            <w:vAlign w:val="center"/>
-          </w:tcPr>
-          <w:p>
-            <w:pPr>
+            <w:shd w:fill="F2F4F8" w:color="auto" w:val="clear"/>
+            <w:tcMar>
+              <w:top w:type="dxa" w:w="60"/>
+              <w:left w:type="dxa" w:w="110"/>
+              <w:bottom w:type="dxa" w:w="60"/>
+              <w:right w:type="dxa" w:w="110"/>
+            </w:tcMar>
+            <w:vAlign w:val="center"/>
+          </w:tcPr>
+          <w:p>
+            <w:pPr>
+              <w:keepNext w:val="false"/>
               <w:spacing w:after="0" w:line="252"/>
             </w:pPr>
             <w:r>
@@ -1975,16 +1880,18 @@
               <w:bottom w:val="single" w:color="A6A6A6" w:sz="4"/>
               <w:right w:val="single" w:color="A6A6A6" w:sz="4"/>
             </w:tcBorders>
-            <w:tcMar>
-              <w:top w:type="dxa" w:w="60"/>
-              <w:left w:type="dxa" w:w="110"/>
-              <w:bottom w:type="dxa" w:w="60"/>
-              <w:right w:type="dxa" w:w="110"/>
-            </w:tcMar>
-            <w:vAlign w:val="center"/>
-          </w:tcPr>
-          <w:p>
-            <w:pPr>
+            <w:shd w:fill="F2F4F8" w:color="auto" w:val="clear"/>
+            <w:tcMar>
+              <w:top w:type="dxa" w:w="60"/>
+              <w:left w:type="dxa" w:w="110"/>
+              <w:bottom w:type="dxa" w:w="60"/>
+              <w:right w:type="dxa" w:w="110"/>
+            </w:tcMar>
+            <w:vAlign w:val="center"/>
+          </w:tcPr>
+          <w:p>
+            <w:pPr>
+              <w:keepNext w:val="false"/>
               <w:spacing w:after="0" w:line="252"/>
             </w:pPr>
             <w:r>
@@ -2075,7 +1982,7 @@
         <w:t xml:space="preserve">15.3	</w:t>
       </w:r>
       <w:r>
-        <w:t xml:space="preserve">Annex 1 (Indicative Initial Activities) is attached for reference only and may be updated by the Parties’ coordinators without a formal amendment of this MoU.</w:t>
+        <w:t xml:space="preserve">Annex 1 (Indicative Initial Activities) is attached for reference only and may be updated by mutual agreement of the Parties in writing without a formal amendment of this MoU.</w:t>
       </w:r>
     </w:p>
     <w:p>
@@ -2134,6 +2041,7 @@
           </w:tcPr>
           <w:p>
             <w:pPr>
+              <w:keepNext w:val="false"/>
               <w:spacing w:after="0" w:line="252"/>
             </w:pPr>
             <w:r>
@@ -2146,6 +2054,7 @@
           </w:p>
           <w:p>
             <w:pPr>
+              <w:keepNext w:val="false"/>
               <w:spacing w:after="0" w:line="252"/>
             </w:pPr>
             <w:r>
@@ -2154,21 +2063,25 @@
           </w:p>
           <w:p>
             <w:pPr>
-              <w:spacing w:after="0" w:line="252"/>
-            </w:pPr>
-          </w:p>
-          <w:p>
-            <w:pPr>
-              <w:spacing w:after="0" w:line="252"/>
-            </w:pPr>
-          </w:p>
-          <w:p>
-            <w:pPr>
-              <w:spacing w:after="0" w:line="252"/>
-            </w:pPr>
-          </w:p>
-          <w:p>
-            <w:pPr>
+              <w:keepNext w:val="false"/>
+              <w:spacing w:after="0" w:line="252"/>
+            </w:pPr>
+          </w:p>
+          <w:p>
+            <w:pPr>
+              <w:keepNext w:val="false"/>
+              <w:spacing w:after="0" w:line="252"/>
+            </w:pPr>
+          </w:p>
+          <w:p>
+            <w:pPr>
+              <w:keepNext w:val="false"/>
+              <w:spacing w:after="0" w:line="252"/>
+            </w:pPr>
+          </w:p>
+          <w:p>
+            <w:pPr>
+              <w:keepNext w:val="false"/>
               <w:spacing w:after="0" w:line="252"/>
             </w:pPr>
             <w:r>
@@ -2177,6 +2090,7 @@
           </w:p>
           <w:p>
             <w:pPr>
+              <w:keepNext w:val="false"/>
               <w:spacing w:after="0" w:line="252"/>
             </w:pPr>
             <w:r>
@@ -2185,6 +2099,7 @@
           </w:p>
           <w:p>
             <w:pPr>
+              <w:keepNext w:val="false"/>
               <w:spacing w:after="0" w:line="252"/>
             </w:pPr>
             <w:r>
@@ -2193,6 +2108,7 @@
           </w:p>
           <w:p>
             <w:pPr>
+              <w:keepNext w:val="false"/>
               <w:spacing w:after="0" w:line="252"/>
             </w:pPr>
             <w:r>
@@ -2207,11 +2123,13 @@
           </w:p>
           <w:p>
             <w:pPr>
-              <w:spacing w:after="0" w:line="252"/>
-            </w:pPr>
-          </w:p>
-          <w:p>
-            <w:pPr>
+              <w:keepNext w:val="false"/>
+              <w:spacing w:after="0" w:line="252"/>
+            </w:pPr>
+          </w:p>
+          <w:p>
+            <w:pPr>
+              <w:keepNext w:val="false"/>
               <w:spacing w:after="0" w:line="252"/>
             </w:pPr>
             <w:r>
@@ -2238,6 +2156,7 @@
           </w:tcPr>
           <w:p>
             <w:pPr>
+              <w:keepNext w:val="false"/>
               <w:spacing w:after="0" w:line="252"/>
             </w:pPr>
             <w:r>
@@ -2250,6 +2169,7 @@
           </w:p>
           <w:p>
             <w:pPr>
+              <w:keepNext w:val="false"/>
               <w:spacing w:after="0" w:line="252"/>
             </w:pPr>
             <w:r>
@@ -2258,21 +2178,25 @@
           </w:p>
           <w:p>
             <w:pPr>
-              <w:spacing w:after="0" w:line="252"/>
-            </w:pPr>
-          </w:p>
-          <w:p>
-            <w:pPr>
-              <w:spacing w:after="0" w:line="252"/>
-            </w:pPr>
-          </w:p>
-          <w:p>
-            <w:pPr>
-              <w:spacing w:after="0" w:line="252"/>
-            </w:pPr>
-          </w:p>
-          <w:p>
-            <w:pPr>
+              <w:keepNext w:val="false"/>
+              <w:spacing w:after="0" w:line="252"/>
+            </w:pPr>
+          </w:p>
+          <w:p>
+            <w:pPr>
+              <w:keepNext w:val="false"/>
+              <w:spacing w:after="0" w:line="252"/>
+            </w:pPr>
+          </w:p>
+          <w:p>
+            <w:pPr>
+              <w:keepNext w:val="false"/>
+              <w:spacing w:after="0" w:line="252"/>
+            </w:pPr>
+          </w:p>
+          <w:p>
+            <w:pPr>
+              <w:keepNext w:val="false"/>
               <w:spacing w:after="0" w:line="252"/>
             </w:pPr>
             <w:r>
@@ -2281,6 +2205,7 @@
           </w:p>
           <w:p>
             <w:pPr>
+              <w:keepNext w:val="false"/>
               <w:spacing w:after="0" w:line="252"/>
             </w:pPr>
             <w:r>
@@ -2295,6 +2220,7 @@
           </w:p>
           <w:p>
             <w:pPr>
+              <w:keepNext w:val="false"/>
               <w:spacing w:after="0" w:line="252"/>
             </w:pPr>
             <w:r>
@@ -2309,6 +2235,7 @@
           </w:p>
           <w:p>
             <w:pPr>
+              <w:keepNext w:val="false"/>
               <w:spacing w:after="0" w:line="252"/>
             </w:pPr>
             <w:r>
@@ -2323,11 +2250,13 @@
           </w:p>
           <w:p>
             <w:pPr>
-              <w:spacing w:after="0" w:line="252"/>
-            </w:pPr>
-          </w:p>
-          <w:p>
-            <w:pPr>
+              <w:keepNext w:val="false"/>
+              <w:spacing w:after="0" w:line="252"/>
+            </w:pPr>
+          </w:p>
+          <w:p>
+            <w:pPr>
+              <w:keepNext w:val="false"/>
               <w:spacing w:after="0" w:line="252"/>
             </w:pPr>
             <w:r>
@@ -2425,6 +2354,7 @@
           </w:tcPr>
           <w:p>
             <w:pPr>
+              <w:keepNext w:val="false"/>
               <w:spacing w:after="0" w:line="252"/>
             </w:pPr>
             <w:r>
@@ -2457,6 +2387,7 @@
           </w:tcPr>
           <w:p>
             <w:pPr>
+              <w:keepNext w:val="false"/>
               <w:spacing w:after="0" w:line="252"/>
             </w:pPr>
             <w:r>
@@ -2489,6 +2420,7 @@
           </w:tcPr>
           <w:p>
             <w:pPr>
+              <w:keepNext w:val="false"/>
               <w:spacing w:after="0" w:line="252"/>
             </w:pPr>
             <w:r>
@@ -2521,6 +2453,7 @@
           </w:tcPr>
           <w:p>
             <w:pPr>
+              <w:keepNext w:val="false"/>
               <w:spacing w:after="0" w:line="252"/>
             </w:pPr>
             <w:r>
@@ -2557,6 +2490,7 @@
           </w:tcPr>
           <w:p>
             <w:pPr>
+              <w:keepNext w:val="false"/>
               <w:spacing w:after="0" w:line="252"/>
             </w:pPr>
             <w:r>
@@ -2583,10 +2517,11 @@
           </w:tcPr>
           <w:p>
             <w:pPr>
-              <w:spacing w:after="0" w:line="252"/>
-            </w:pPr>
-            <w:r>
-              <w:t xml:space="preserve">Appointment of coordinators and exchange of contact details</w:t>
+              <w:keepNext w:val="false"/>
+              <w:spacing w:after="0" w:line="252"/>
+            </w:pPr>
+            <w:r>
+              <w:t xml:space="preserve">Visit of Panshi specialists to the Museum; assessment of exhibition spaces and needs</w:t>
             </w:r>
           </w:p>
         </w:tc>
@@ -2609,10 +2544,11 @@
           </w:tcPr>
           <w:p>
             <w:pPr>
-              <w:spacing w:after="0" w:line="252"/>
-            </w:pPr>
-            <w:r>
-              <w:t xml:space="preserve">Both Parties</w:t>
+              <w:keepNext w:val="false"/>
+              <w:spacing w:after="0" w:line="252"/>
+            </w:pPr>
+            <w:r>
+              <w:t xml:space="preserve">Panshi, with the Museum’s support</w:t>
             </w:r>
           </w:p>
         </w:tc>
@@ -2635,10 +2571,14 @@
           </w:tcPr>
           <w:p>
             <w:pPr>
-              <w:spacing w:after="0" w:line="252"/>
-            </w:pPr>
-            <w:r>
-              <w:t xml:space="preserve">Within 30 days of signing</w:t>
+              <w:keepNext w:val="false"/>
+              <w:spacing w:after="0" w:line="252"/>
+            </w:pPr>
+            <w:r>
+              <w:rPr>
+                <w:highlight w:val="yellow"/>
+              </w:rPr>
+              <w:t xml:space="preserve">[month, year]</w:t>
             </w:r>
           </w:p>
         </w:tc>
@@ -2667,6 +2607,7 @@
           </w:tcPr>
           <w:p>
             <w:pPr>
+              <w:keepNext w:val="false"/>
               <w:spacing w:after="0" w:line="252"/>
             </w:pPr>
             <w:r>
@@ -2694,67 +2635,76 @@
           </w:tcPr>
           <w:p>
             <w:pPr>
-              <w:spacing w:after="0" w:line="252"/>
-            </w:pPr>
-            <w:r>
-              <w:t xml:space="preserve">Visit of Panshi specialists to the Museum; assessment of exhibition spaces and needs</w:t>
-            </w:r>
-          </w:p>
-        </w:tc>
-        <w:tc>
-          <w:tcPr>
-            <w:tcW w:type="dxa" w:w="2200"/>
-            <w:tcBorders>
-              <w:top w:val="single" w:color="A6A6A6" w:sz="4"/>
-              <w:left w:val="single" w:color="A6A6A6" w:sz="4"/>
-              <w:bottom w:val="single" w:color="A6A6A6" w:sz="4"/>
-              <w:right w:val="single" w:color="A6A6A6" w:sz="4"/>
-            </w:tcBorders>
-            <w:shd w:fill="F2F4F8" w:color="auto" w:val="clear"/>
-            <w:tcMar>
-              <w:top w:type="dxa" w:w="60"/>
-              <w:left w:type="dxa" w:w="110"/>
-              <w:bottom w:type="dxa" w:w="60"/>
-              <w:right w:type="dxa" w:w="110"/>
-            </w:tcMar>
-            <w:vAlign w:val="center"/>
-          </w:tcPr>
-          <w:p>
-            <w:pPr>
-              <w:spacing w:after="0" w:line="252"/>
-            </w:pPr>
-            <w:r>
-              <w:t xml:space="preserve">Panshi, with the Museum’s support</w:t>
-            </w:r>
-          </w:p>
-        </w:tc>
-        <w:tc>
-          <w:tcPr>
-            <w:tcW w:type="dxa" w:w="2000"/>
-            <w:tcBorders>
-              <w:top w:val="single" w:color="A6A6A6" w:sz="4"/>
-              <w:left w:val="single" w:color="A6A6A6" w:sz="4"/>
-              <w:bottom w:val="single" w:color="A6A6A6" w:sz="4"/>
-              <w:right w:val="single" w:color="A6A6A6" w:sz="4"/>
-            </w:tcBorders>
-            <w:shd w:fill="F2F4F8" w:color="auto" w:val="clear"/>
-            <w:tcMar>
-              <w:top w:type="dxa" w:w="60"/>
-              <w:left w:type="dxa" w:w="110"/>
-              <w:bottom w:type="dxa" w:w="60"/>
-              <w:right w:type="dxa" w:w="110"/>
-            </w:tcMar>
-            <w:vAlign w:val="center"/>
-          </w:tcPr>
-          <w:p>
-            <w:pPr>
-              <w:spacing w:after="0" w:line="252"/>
-            </w:pPr>
+              <w:keepNext w:val="false"/>
+              <w:spacing w:after="0" w:line="252"/>
+            </w:pPr>
+            <w:r>
+              <w:t xml:space="preserve">Preparation of a concept and technical proposal for </w:t>
+            </w:r>
             <w:r>
               <w:rPr>
                 <w:highlight w:val="yellow"/>
               </w:rPr>
-              <w:t xml:space="preserve">[month, year]</w:t>
+              <w:t xml:space="preserve">[the modernisation of the Museum’s interactive science exhibition]</w:t>
+            </w:r>
+          </w:p>
+        </w:tc>
+        <w:tc>
+          <w:tcPr>
+            <w:tcW w:type="dxa" w:w="2200"/>
+            <w:tcBorders>
+              <w:top w:val="single" w:color="A6A6A6" w:sz="4"/>
+              <w:left w:val="single" w:color="A6A6A6" w:sz="4"/>
+              <w:bottom w:val="single" w:color="A6A6A6" w:sz="4"/>
+              <w:right w:val="single" w:color="A6A6A6" w:sz="4"/>
+            </w:tcBorders>
+            <w:shd w:fill="F2F4F8" w:color="auto" w:val="clear"/>
+            <w:tcMar>
+              <w:top w:type="dxa" w:w="60"/>
+              <w:left w:type="dxa" w:w="110"/>
+              <w:bottom w:type="dxa" w:w="60"/>
+              <w:right w:type="dxa" w:w="110"/>
+            </w:tcMar>
+            <w:vAlign w:val="center"/>
+          </w:tcPr>
+          <w:p>
+            <w:pPr>
+              <w:keepNext w:val="false"/>
+              <w:spacing w:after="0" w:line="252"/>
+            </w:pPr>
+            <w:r>
+              <w:t xml:space="preserve">Panshi</w:t>
+            </w:r>
+          </w:p>
+        </w:tc>
+        <w:tc>
+          <w:tcPr>
+            <w:tcW w:type="dxa" w:w="2000"/>
+            <w:tcBorders>
+              <w:top w:val="single" w:color="A6A6A6" w:sz="4"/>
+              <w:left w:val="single" w:color="A6A6A6" w:sz="4"/>
+              <w:bottom w:val="single" w:color="A6A6A6" w:sz="4"/>
+              <w:right w:val="single" w:color="A6A6A6" w:sz="4"/>
+            </w:tcBorders>
+            <w:shd w:fill="F2F4F8" w:color="auto" w:val="clear"/>
+            <w:tcMar>
+              <w:top w:type="dxa" w:w="60"/>
+              <w:left w:type="dxa" w:w="110"/>
+              <w:bottom w:type="dxa" w:w="60"/>
+              <w:right w:type="dxa" w:w="110"/>
+            </w:tcMar>
+            <w:vAlign w:val="center"/>
+          </w:tcPr>
+          <w:p>
+            <w:pPr>
+              <w:keepNext w:val="false"/>
+              <w:spacing w:after="0" w:line="252"/>
+            </w:pPr>
+            <w:r>
+              <w:rPr>
+                <w:highlight w:val="yellow"/>
+              </w:rPr>
+              <w:t xml:space="preserve">[__ weeks after the visit]</w:t>
             </w:r>
           </w:p>
         </w:tc>
@@ -2782,6 +2732,7 @@
           </w:tcPr>
           <w:p>
             <w:pPr>
+              <w:keepNext w:val="false"/>
               <w:spacing w:after="0" w:line="252"/>
             </w:pPr>
             <w:r>
@@ -2808,71 +2759,68 @@
           </w:tcPr>
           <w:p>
             <w:pPr>
-              <w:spacing w:after="0" w:line="252"/>
-            </w:pPr>
-            <w:r>
-              <w:t xml:space="preserve">Preparation of a concept and technical proposal for </w:t>
-            </w:r>
+              <w:keepNext w:val="false"/>
+              <w:spacing w:after="0" w:line="252"/>
+            </w:pPr>
+            <w:r>
+              <w:t xml:space="preserve">Study visit of Museum staff to Panshi’s production facilities and reference projects in China</w:t>
+            </w:r>
+          </w:p>
+        </w:tc>
+        <w:tc>
+          <w:tcPr>
+            <w:tcW w:type="dxa" w:w="2200"/>
+            <w:tcBorders>
+              <w:top w:val="single" w:color="A6A6A6" w:sz="4"/>
+              <w:left w:val="single" w:color="A6A6A6" w:sz="4"/>
+              <w:bottom w:val="single" w:color="A6A6A6" w:sz="4"/>
+              <w:right w:val="single" w:color="A6A6A6" w:sz="4"/>
+            </w:tcBorders>
+            <w:tcMar>
+              <w:top w:type="dxa" w:w="60"/>
+              <w:left w:type="dxa" w:w="110"/>
+              <w:bottom w:type="dxa" w:w="60"/>
+              <w:right w:type="dxa" w:w="110"/>
+            </w:tcMar>
+            <w:vAlign w:val="center"/>
+          </w:tcPr>
+          <w:p>
+            <w:pPr>
+              <w:keepNext w:val="false"/>
+              <w:spacing w:after="0" w:line="252"/>
+            </w:pPr>
+            <w:r>
+              <w:t xml:space="preserve">Both Parties</w:t>
+            </w:r>
+          </w:p>
+        </w:tc>
+        <w:tc>
+          <w:tcPr>
+            <w:tcW w:type="dxa" w:w="2000"/>
+            <w:tcBorders>
+              <w:top w:val="single" w:color="A6A6A6" w:sz="4"/>
+              <w:left w:val="single" w:color="A6A6A6" w:sz="4"/>
+              <w:bottom w:val="single" w:color="A6A6A6" w:sz="4"/>
+              <w:right w:val="single" w:color="A6A6A6" w:sz="4"/>
+            </w:tcBorders>
+            <w:tcMar>
+              <w:top w:type="dxa" w:w="60"/>
+              <w:left w:type="dxa" w:w="110"/>
+              <w:bottom w:type="dxa" w:w="60"/>
+              <w:right w:type="dxa" w:w="110"/>
+            </w:tcMar>
+            <w:vAlign w:val="center"/>
+          </w:tcPr>
+          <w:p>
+            <w:pPr>
+              <w:keepNext w:val="false"/>
+              <w:spacing w:after="0" w:line="252"/>
+            </w:pPr>
             <w:r>
               <w:rPr>
                 <w:highlight w:val="yellow"/>
               </w:rPr>
-              <w:t xml:space="preserve">[the modernisation of the Museum’s interactive science exhibition]</w:t>
-            </w:r>
-          </w:p>
-        </w:tc>
-        <w:tc>
-          <w:tcPr>
-            <w:tcW w:type="dxa" w:w="2200"/>
-            <w:tcBorders>
-              <w:top w:val="single" w:color="A6A6A6" w:sz="4"/>
-              <w:left w:val="single" w:color="A6A6A6" w:sz="4"/>
-              <w:bottom w:val="single" w:color="A6A6A6" w:sz="4"/>
-              <w:right w:val="single" w:color="A6A6A6" w:sz="4"/>
-            </w:tcBorders>
-            <w:tcMar>
-              <w:top w:type="dxa" w:w="60"/>
-              <w:left w:type="dxa" w:w="110"/>
-              <w:bottom w:type="dxa" w:w="60"/>
-              <w:right w:type="dxa" w:w="110"/>
-            </w:tcMar>
-            <w:vAlign w:val="center"/>
-          </w:tcPr>
-          <w:p>
-            <w:pPr>
-              <w:spacing w:after="0" w:line="252"/>
-            </w:pPr>
-            <w:r>
-              <w:t xml:space="preserve">Panshi</w:t>
-            </w:r>
-          </w:p>
-        </w:tc>
-        <w:tc>
-          <w:tcPr>
-            <w:tcW w:type="dxa" w:w="2000"/>
-            <w:tcBorders>
-              <w:top w:val="single" w:color="A6A6A6" w:sz="4"/>
-              <w:left w:val="single" w:color="A6A6A6" w:sz="4"/>
-              <w:bottom w:val="single" w:color="A6A6A6" w:sz="4"/>
-              <w:right w:val="single" w:color="A6A6A6" w:sz="4"/>
-            </w:tcBorders>
-            <w:tcMar>
-              <w:top w:type="dxa" w:w="60"/>
-              <w:left w:type="dxa" w:w="110"/>
-              <w:bottom w:type="dxa" w:w="60"/>
-              <w:right w:type="dxa" w:w="110"/>
-            </w:tcMar>
-            <w:vAlign w:val="center"/>
-          </w:tcPr>
-          <w:p>
-            <w:pPr>
-              <w:spacing w:after="0" w:line="252"/>
-            </w:pPr>
-            <w:r>
-              <w:rPr>
-                <w:highlight w:val="yellow"/>
-              </w:rPr>
-              <w:t xml:space="preserve">[__ weeks after the visit]</w:t>
+              <w:t xml:space="preserve">[month, year]</w:t>
             </w:r>
           </w:p>
         </w:tc>
@@ -2901,6 +2849,7 @@
           </w:tcPr>
           <w:p>
             <w:pPr>
+              <w:keepNext w:val="false"/>
               <w:spacing w:after="0" w:line="252"/>
             </w:pPr>
             <w:r>
@@ -2928,10 +2877,11 @@
           </w:tcPr>
           <w:p>
             <w:pPr>
-              <w:spacing w:after="0" w:line="252"/>
-            </w:pPr>
-            <w:r>
-              <w:t xml:space="preserve">Study visit of Museum staff to Panshi’s production facilities and reference projects in China</w:t>
+              <w:keepNext w:val="false"/>
+              <w:spacing w:after="0" w:line="252"/>
+            </w:pPr>
+            <w:r>
+              <w:t xml:space="preserve">Training workshop for Museum staff on interactive exhibits and museum education</w:t>
             </w:r>
           </w:p>
         </w:tc>
@@ -2955,10 +2905,11 @@
           </w:tcPr>
           <w:p>
             <w:pPr>
-              <w:spacing w:after="0" w:line="252"/>
-            </w:pPr>
-            <w:r>
-              <w:t xml:space="preserve">Both Parties</w:t>
+              <w:keepNext w:val="false"/>
+              <w:spacing w:after="0" w:line="252"/>
+            </w:pPr>
+            <w:r>
+              <w:t xml:space="preserve">Panshi</w:t>
             </w:r>
           </w:p>
         </w:tc>
@@ -2982,6 +2933,7 @@
           </w:tcPr>
           <w:p>
             <w:pPr>
+              <w:keepNext w:val="false"/>
               <w:spacing w:after="0" w:line="252"/>
             </w:pPr>
             <w:r>
@@ -3016,6 +2968,7 @@
           </w:tcPr>
           <w:p>
             <w:pPr>
+              <w:keepNext w:val="false"/>
               <w:spacing w:after="0" w:line="252"/>
             </w:pPr>
             <w:r>
@@ -3042,10 +2995,11 @@
           </w:tcPr>
           <w:p>
             <w:pPr>
-              <w:spacing w:after="0" w:line="252"/>
-            </w:pPr>
-            <w:r>
-              <w:t xml:space="preserve">Training workshop for Museum staff on interactive exhibits and museum education</w:t>
+              <w:keepNext w:val="false"/>
+              <w:spacing w:after="0" w:line="252"/>
+            </w:pPr>
+            <w:r>
+              <w:t xml:space="preserve">First meeting of the Joint Working Group; approval of the annual plan of activities</w:t>
             </w:r>
           </w:p>
         </w:tc>
@@ -3068,10 +3022,11 @@
           </w:tcPr>
           <w:p>
             <w:pPr>
-              <w:spacing w:after="0" w:line="252"/>
-            </w:pPr>
-            <w:r>
-              <w:t xml:space="preserve">Panshi</w:t>
+              <w:keepNext w:val="false"/>
+              <w:spacing w:after="0" w:line="252"/>
+            </w:pPr>
+            <w:r>
+              <w:t xml:space="preserve">Both Parties</w:t>
             </w:r>
           </w:p>
         </w:tc>
@@ -3094,122 +3049,7 @@
           </w:tcPr>
           <w:p>
             <w:pPr>
-              <w:spacing w:after="0" w:line="252"/>
-            </w:pPr>
-            <w:r>
-              <w:rPr>
-                <w:highlight w:val="yellow"/>
-              </w:rPr>
-              <w:t xml:space="preserve">[month, year]</w:t>
-            </w:r>
-          </w:p>
-        </w:tc>
-      </w:tr>
-      <w:tr>
-        <w:trPr>
-          <w:cantSplit/>
-        </w:trPr>
-        <w:tc>
-          <w:tcPr>
-            <w:tcW w:type="dxa" w:w="600"/>
-            <w:tcBorders>
-              <w:top w:val="single" w:color="A6A6A6" w:sz="4"/>
-              <w:left w:val="single" w:color="A6A6A6" w:sz="4"/>
-              <w:bottom w:val="single" w:color="A6A6A6" w:sz="4"/>
-              <w:right w:val="single" w:color="A6A6A6" w:sz="4"/>
-            </w:tcBorders>
-            <w:shd w:fill="F2F4F8" w:color="auto" w:val="clear"/>
-            <w:tcMar>
-              <w:top w:type="dxa" w:w="60"/>
-              <w:left w:type="dxa" w:w="110"/>
-              <w:bottom w:type="dxa" w:w="60"/>
-              <w:right w:type="dxa" w:w="110"/>
-            </w:tcMar>
-            <w:vAlign w:val="center"/>
-          </w:tcPr>
-          <w:p>
-            <w:pPr>
-              <w:spacing w:after="0" w:line="252"/>
-            </w:pPr>
-            <w:r>
-              <w:t xml:space="preserve">6</w:t>
-            </w:r>
-          </w:p>
-        </w:tc>
-        <w:tc>
-          <w:tcPr>
-            <w:tcW w:type="dxa" w:w="4270"/>
-            <w:tcBorders>
-              <w:top w:val="single" w:color="A6A6A6" w:sz="4"/>
-              <w:left w:val="single" w:color="A6A6A6" w:sz="4"/>
-              <w:bottom w:val="single" w:color="A6A6A6" w:sz="4"/>
-              <w:right w:val="single" w:color="A6A6A6" w:sz="4"/>
-            </w:tcBorders>
-            <w:shd w:fill="F2F4F8" w:color="auto" w:val="clear"/>
-            <w:tcMar>
-              <w:top w:type="dxa" w:w="60"/>
-              <w:left w:type="dxa" w:w="110"/>
-              <w:bottom w:type="dxa" w:w="60"/>
-              <w:right w:type="dxa" w:w="110"/>
-            </w:tcMar>
-            <w:vAlign w:val="center"/>
-          </w:tcPr>
-          <w:p>
-            <w:pPr>
-              <w:spacing w:after="0" w:line="252"/>
-            </w:pPr>
-            <w:r>
-              <w:t xml:space="preserve">First meeting of the Joint Working Group; approval of the annual plan of activities</w:t>
-            </w:r>
-          </w:p>
-        </w:tc>
-        <w:tc>
-          <w:tcPr>
-            <w:tcW w:type="dxa" w:w="2200"/>
-            <w:tcBorders>
-              <w:top w:val="single" w:color="A6A6A6" w:sz="4"/>
-              <w:left w:val="single" w:color="A6A6A6" w:sz="4"/>
-              <w:bottom w:val="single" w:color="A6A6A6" w:sz="4"/>
-              <w:right w:val="single" w:color="A6A6A6" w:sz="4"/>
-            </w:tcBorders>
-            <w:shd w:fill="F2F4F8" w:color="auto" w:val="clear"/>
-            <w:tcMar>
-              <w:top w:type="dxa" w:w="60"/>
-              <w:left w:type="dxa" w:w="110"/>
-              <w:bottom w:type="dxa" w:w="60"/>
-              <w:right w:type="dxa" w:w="110"/>
-            </w:tcMar>
-            <w:vAlign w:val="center"/>
-          </w:tcPr>
-          <w:p>
-            <w:pPr>
-              <w:spacing w:after="0" w:line="252"/>
-            </w:pPr>
-            <w:r>
-              <w:t xml:space="preserve">Both Parties</w:t>
-            </w:r>
-          </w:p>
-        </w:tc>
-        <w:tc>
-          <w:tcPr>
-            <w:tcW w:type="dxa" w:w="2000"/>
-            <w:tcBorders>
-              <w:top w:val="single" w:color="A6A6A6" w:sz="4"/>
-              <w:left w:val="single" w:color="A6A6A6" w:sz="4"/>
-              <w:bottom w:val="single" w:color="A6A6A6" w:sz="4"/>
-              <w:right w:val="single" w:color="A6A6A6" w:sz="4"/>
-            </w:tcBorders>
-            <w:shd w:fill="F2F4F8" w:color="auto" w:val="clear"/>
-            <w:tcMar>
-              <w:top w:type="dxa" w:w="60"/>
-              <w:left w:type="dxa" w:w="110"/>
-              <w:bottom w:type="dxa" w:w="60"/>
-              <w:right w:type="dxa" w:w="110"/>
-            </w:tcMar>
-            <w:vAlign w:val="center"/>
-          </w:tcPr>
-          <w:p>
-            <w:pPr>
+              <w:keepNext w:val="false"/>
               <w:spacing w:after="0" w:line="252"/>
             </w:pPr>
             <w:r>

</xml_diff>

<commit_message>
Trim MoU final provisions and add e-mail contacts
Article 15 now only states the two English originals; the
counterparts and annex-update clauses are removed. Both parties'
e-mail addresses added to the contacts table.

Co-Authored-By: Claude Opus 5.5 <noreply@anthropic.com>
Claude-Session: https://claude.ai/code/session_01Lu4QoaDikGyrPsvsHy5NF8
</commit_message>
<xml_diff>
--- a/memorandum/MoU_Tashkent_Polytechnic_Museum_Panshi_DRAFT.docx
+++ b/memorandum/MoU_Tashkent_Polytechnic_Museum_Panshi_DRAFT.docx
@@ -1769,10 +1769,7 @@
               <w:spacing w:after="0" w:line="252"/>
             </w:pPr>
             <w:r>
-              <w:rPr>
-                <w:highlight w:val="yellow"/>
-              </w:rPr>
-              <w:t xml:space="preserve">[e-mail]</w:t>
+              <w:t xml:space="preserve">museum@uzavtosanoat.uz</w:t>
             </w:r>
           </w:p>
         </w:tc>
@@ -1799,10 +1796,7 @@
               <w:spacing w:after="0" w:line="252"/>
             </w:pPr>
             <w:r>
-              <w:rPr>
-                <w:highlight w:val="yellow"/>
-              </w:rPr>
-              <w:t xml:space="preserve">[e-mail]</w:t>
+              <w:t xml:space="preserve">panshizhineng@outlook.com</w:t>
             </w:r>
           </w:p>
         </w:tc>
@@ -1934,55 +1928,7 @@
         <w:t xml:space="preserve">15.1	</w:t>
       </w:r>
       <w:r>
-        <w:t xml:space="preserve">This MoU is signed in </w:t>
-      </w:r>
-      <w:r>
-        <w:rPr>
-          <w:highlight w:val="yellow"/>
-        </w:rPr>
-        <w:t xml:space="preserve">[Tashkent]</w:t>
-      </w:r>
-      <w:r>
-        <w:t xml:space="preserve"> on </w:t>
-      </w:r>
-      <w:r>
-        <w:rPr>
-          <w:highlight w:val="yellow"/>
-        </w:rPr>
-        <w:t xml:space="preserve">[date]</w:t>
-      </w:r>
-      <w:r>
-        <w:t xml:space="preserve"> in two (2) original copies in the English language, one for each Party, both being equally authentic. Translations into Uzbek and Chinese may be prepared for convenience; in the event of any discrepancy, the English text shall prevail.</w:t>
-      </w:r>
-    </w:p>
-    <w:p>
-      <w:pPr>
-        <w:tabs>
-          <w:tab w:val="left" w:pos="709"/>
-        </w:tabs>
-        <w:ind w:left="709" w:hanging="709"/>
-        <w:jc w:val="both"/>
-      </w:pPr>
-      <w:r>
-        <w:t xml:space="preserve">15.2	</w:t>
-      </w:r>
-      <w:r>
-        <w:t xml:space="preserve">This MoU may be signed in counterparts, including by the exchange of scanned signed copies, each of which shall be deemed an original.</w:t>
-      </w:r>
-    </w:p>
-    <w:p>
-      <w:pPr>
-        <w:tabs>
-          <w:tab w:val="left" w:pos="709"/>
-        </w:tabs>
-        <w:ind w:left="709" w:hanging="709"/>
-        <w:jc w:val="both"/>
-      </w:pPr>
-      <w:r>
-        <w:t xml:space="preserve">15.3	</w:t>
-      </w:r>
-      <w:r>
-        <w:t xml:space="preserve">Annex 1 (Indicative Initial Activities) is attached for reference only and may be updated by mutual agreement of the Parties in writing without a formal amendment of this MoU.</w:t>
+        <w:t xml:space="preserve">This MoU is executed in two (2) original copies in the English language, one for each Party, both being equally authentic.</w:t>
       </w:r>
     </w:p>
     <w:p>

</xml_diff>

<commit_message>
Remove Annex 1 from the MoU
Co-Authored-By: Claude Opus 5.5 <noreply@anthropic.com>
Claude-Session: https://claude.ai/code/session_01Lu4QoaDikGyrPsvsHy5NF8
</commit_message>
<xml_diff>
--- a/memorandum/MoU_Tashkent_Polytechnic_Museum_Panshi_DRAFT.docx
+++ b/memorandum/MoU_Tashkent_Polytechnic_Museum_Panshi_DRAFT.docx
@@ -2207,802 +2207,6 @@
             </w:pPr>
             <w:r>
               <w:t xml:space="preserve">L.S.</w:t>
-            </w:r>
-          </w:p>
-        </w:tc>
-      </w:tr>
-    </w:tbl>
-    <w:p>
-      <w:pPr>
-        <w:pageBreakBefore/>
-        <w:jc w:val="right"/>
-      </w:pPr>
-      <w:r>
-        <w:rPr>
-          <w:i/>
-          <w:iCs/>
-        </w:rPr>
-        <w:t xml:space="preserve">Annex 1 to the MoU</w:t>
-      </w:r>
-    </w:p>
-    <w:p>
-      <w:pPr>
-        <w:spacing w:after="60" w:before="120"/>
-        <w:jc w:val="center"/>
-      </w:pPr>
-      <w:r>
-        <w:rPr>
-          <w:b/>
-          <w:bCs/>
-          <w:color w:val="1F3864"/>
-          <w:sz w:val="26"/>
-          <w:szCs w:val="26"/>
-        </w:rPr>
-        <w:t xml:space="preserve">INDICATIVE INITIAL ACTIVITIES</w:t>
-      </w:r>
-    </w:p>
-    <w:p>
-      <w:pPr>
-        <w:spacing w:after="200"/>
-        <w:jc w:val="center"/>
-        <w:rPr>
-          <w:i/>
-          <w:iCs/>
-        </w:rPr>
-      </w:pPr>
-      <w:r>
-        <w:rPr>
-          <w:i/>
-          <w:iCs/>
-        </w:rPr>
-        <w:t xml:space="preserve">(for reference; non-binding)</w:t>
-      </w:r>
-    </w:p>
-    <w:tbl>
-      <w:tblPr>
-        <w:tblW w:type="dxa" w:w="9070"/>
-        <w:tblBorders>
-          <w:top w:val="single" w:color="auto" w:sz="4"/>
-          <w:left w:val="single" w:color="auto" w:sz="4"/>
-          <w:bottom w:val="single" w:color="auto" w:sz="4"/>
-          <w:right w:val="single" w:color="auto" w:sz="4"/>
-          <w:insideH w:val="single" w:color="auto" w:sz="4"/>
-          <w:insideV w:val="single" w:color="auto" w:sz="4"/>
-        </w:tblBorders>
-      </w:tblPr>
-      <w:tblGrid>
-        <w:gridCol w:w="600"/>
-        <w:gridCol w:w="4270"/>
-        <w:gridCol w:w="2200"/>
-        <w:gridCol w:w="2000"/>
-      </w:tblGrid>
-      <w:tr>
-        <w:trPr>
-          <w:tblHeader/>
-        </w:trPr>
-        <w:tc>
-          <w:tcPr>
-            <w:tcW w:type="dxa" w:w="600"/>
-            <w:tcBorders>
-              <w:top w:val="single" w:color="A6A6A6" w:sz="4"/>
-              <w:left w:val="single" w:color="A6A6A6" w:sz="4"/>
-              <w:bottom w:val="single" w:color="A6A6A6" w:sz="4"/>
-              <w:right w:val="single" w:color="A6A6A6" w:sz="4"/>
-            </w:tcBorders>
-            <w:shd w:fill="1F3864" w:color="auto" w:val="clear"/>
-            <w:tcMar>
-              <w:top w:type="dxa" w:w="60"/>
-              <w:left w:type="dxa" w:w="110"/>
-              <w:bottom w:type="dxa" w:w="60"/>
-              <w:right w:type="dxa" w:w="110"/>
-            </w:tcMar>
-            <w:vAlign w:val="center"/>
-          </w:tcPr>
-          <w:p>
-            <w:pPr>
-              <w:keepNext w:val="false"/>
-              <w:spacing w:after="0" w:line="252"/>
-            </w:pPr>
-            <w:r>
-              <w:rPr>
-                <w:b/>
-                <w:bCs/>
-                <w:color w:val="FFFFFF"/>
-              </w:rPr>
-              <w:t xml:space="preserve">No.</w:t>
-            </w:r>
-          </w:p>
-        </w:tc>
-        <w:tc>
-          <w:tcPr>
-            <w:tcW w:type="dxa" w:w="4270"/>
-            <w:tcBorders>
-              <w:top w:val="single" w:color="A6A6A6" w:sz="4"/>
-              <w:left w:val="single" w:color="A6A6A6" w:sz="4"/>
-              <w:bottom w:val="single" w:color="A6A6A6" w:sz="4"/>
-              <w:right w:val="single" w:color="A6A6A6" w:sz="4"/>
-            </w:tcBorders>
-            <w:shd w:fill="1F3864" w:color="auto" w:val="clear"/>
-            <w:tcMar>
-              <w:top w:type="dxa" w:w="60"/>
-              <w:left w:type="dxa" w:w="110"/>
-              <w:bottom w:type="dxa" w:w="60"/>
-              <w:right w:type="dxa" w:w="110"/>
-            </w:tcMar>
-            <w:vAlign w:val="center"/>
-          </w:tcPr>
-          <w:p>
-            <w:pPr>
-              <w:keepNext w:val="false"/>
-              <w:spacing w:after="0" w:line="252"/>
-            </w:pPr>
-            <w:r>
-              <w:rPr>
-                <w:b/>
-                <w:bCs/>
-                <w:color w:val="FFFFFF"/>
-              </w:rPr>
-              <w:t xml:space="preserve">Activity</w:t>
-            </w:r>
-          </w:p>
-        </w:tc>
-        <w:tc>
-          <w:tcPr>
-            <w:tcW w:type="dxa" w:w="2200"/>
-            <w:tcBorders>
-              <w:top w:val="single" w:color="A6A6A6" w:sz="4"/>
-              <w:left w:val="single" w:color="A6A6A6" w:sz="4"/>
-              <w:bottom w:val="single" w:color="A6A6A6" w:sz="4"/>
-              <w:right w:val="single" w:color="A6A6A6" w:sz="4"/>
-            </w:tcBorders>
-            <w:shd w:fill="1F3864" w:color="auto" w:val="clear"/>
-            <w:tcMar>
-              <w:top w:type="dxa" w:w="60"/>
-              <w:left w:type="dxa" w:w="110"/>
-              <w:bottom w:type="dxa" w:w="60"/>
-              <w:right w:type="dxa" w:w="110"/>
-            </w:tcMar>
-            <w:vAlign w:val="center"/>
-          </w:tcPr>
-          <w:p>
-            <w:pPr>
-              <w:keepNext w:val="false"/>
-              <w:spacing w:after="0" w:line="252"/>
-            </w:pPr>
-            <w:r>
-              <w:rPr>
-                <w:b/>
-                <w:bCs/>
-                <w:color w:val="FFFFFF"/>
-              </w:rPr>
-              <w:t xml:space="preserve">Responsible</w:t>
-            </w:r>
-          </w:p>
-        </w:tc>
-        <w:tc>
-          <w:tcPr>
-            <w:tcW w:type="dxa" w:w="2000"/>
-            <w:tcBorders>
-              <w:top w:val="single" w:color="A6A6A6" w:sz="4"/>
-              <w:left w:val="single" w:color="A6A6A6" w:sz="4"/>
-              <w:bottom w:val="single" w:color="A6A6A6" w:sz="4"/>
-              <w:right w:val="single" w:color="A6A6A6" w:sz="4"/>
-            </w:tcBorders>
-            <w:shd w:fill="1F3864" w:color="auto" w:val="clear"/>
-            <w:tcMar>
-              <w:top w:type="dxa" w:w="60"/>
-              <w:left w:type="dxa" w:w="110"/>
-              <w:bottom w:type="dxa" w:w="60"/>
-              <w:right w:type="dxa" w:w="110"/>
-            </w:tcMar>
-            <w:vAlign w:val="center"/>
-          </w:tcPr>
-          <w:p>
-            <w:pPr>
-              <w:keepNext w:val="false"/>
-              <w:spacing w:after="0" w:line="252"/>
-            </w:pPr>
-            <w:r>
-              <w:rPr>
-                <w:b/>
-                <w:bCs/>
-                <w:color w:val="FFFFFF"/>
-              </w:rPr>
-              <w:t xml:space="preserve">Timeframe</w:t>
-            </w:r>
-          </w:p>
-        </w:tc>
-      </w:tr>
-      <w:tr>
-        <w:trPr>
-          <w:cantSplit/>
-        </w:trPr>
-        <w:tc>
-          <w:tcPr>
-            <w:tcW w:type="dxa" w:w="600"/>
-            <w:tcBorders>
-              <w:top w:val="single" w:color="A6A6A6" w:sz="4"/>
-              <w:left w:val="single" w:color="A6A6A6" w:sz="4"/>
-              <w:bottom w:val="single" w:color="A6A6A6" w:sz="4"/>
-              <w:right w:val="single" w:color="A6A6A6" w:sz="4"/>
-            </w:tcBorders>
-            <w:tcMar>
-              <w:top w:type="dxa" w:w="60"/>
-              <w:left w:type="dxa" w:w="110"/>
-              <w:bottom w:type="dxa" w:w="60"/>
-              <w:right w:type="dxa" w:w="110"/>
-            </w:tcMar>
-            <w:vAlign w:val="center"/>
-          </w:tcPr>
-          <w:p>
-            <w:pPr>
-              <w:keepNext w:val="false"/>
-              <w:spacing w:after="0" w:line="252"/>
-            </w:pPr>
-            <w:r>
-              <w:t xml:space="preserve">1</w:t>
-            </w:r>
-          </w:p>
-        </w:tc>
-        <w:tc>
-          <w:tcPr>
-            <w:tcW w:type="dxa" w:w="4270"/>
-            <w:tcBorders>
-              <w:top w:val="single" w:color="A6A6A6" w:sz="4"/>
-              <w:left w:val="single" w:color="A6A6A6" w:sz="4"/>
-              <w:bottom w:val="single" w:color="A6A6A6" w:sz="4"/>
-              <w:right w:val="single" w:color="A6A6A6" w:sz="4"/>
-            </w:tcBorders>
-            <w:tcMar>
-              <w:top w:type="dxa" w:w="60"/>
-              <w:left w:type="dxa" w:w="110"/>
-              <w:bottom w:type="dxa" w:w="60"/>
-              <w:right w:type="dxa" w:w="110"/>
-            </w:tcMar>
-            <w:vAlign w:val="center"/>
-          </w:tcPr>
-          <w:p>
-            <w:pPr>
-              <w:keepNext w:val="false"/>
-              <w:spacing w:after="0" w:line="252"/>
-            </w:pPr>
-            <w:r>
-              <w:t xml:space="preserve">Visit of Panshi specialists to the Museum; assessment of exhibition spaces and needs</w:t>
-            </w:r>
-          </w:p>
-        </w:tc>
-        <w:tc>
-          <w:tcPr>
-            <w:tcW w:type="dxa" w:w="2200"/>
-            <w:tcBorders>
-              <w:top w:val="single" w:color="A6A6A6" w:sz="4"/>
-              <w:left w:val="single" w:color="A6A6A6" w:sz="4"/>
-              <w:bottom w:val="single" w:color="A6A6A6" w:sz="4"/>
-              <w:right w:val="single" w:color="A6A6A6" w:sz="4"/>
-            </w:tcBorders>
-            <w:tcMar>
-              <w:top w:type="dxa" w:w="60"/>
-              <w:left w:type="dxa" w:w="110"/>
-              <w:bottom w:type="dxa" w:w="60"/>
-              <w:right w:type="dxa" w:w="110"/>
-            </w:tcMar>
-            <w:vAlign w:val="center"/>
-          </w:tcPr>
-          <w:p>
-            <w:pPr>
-              <w:keepNext w:val="false"/>
-              <w:spacing w:after="0" w:line="252"/>
-            </w:pPr>
-            <w:r>
-              <w:t xml:space="preserve">Panshi, with the Museum’s support</w:t>
-            </w:r>
-          </w:p>
-        </w:tc>
-        <w:tc>
-          <w:tcPr>
-            <w:tcW w:type="dxa" w:w="2000"/>
-            <w:tcBorders>
-              <w:top w:val="single" w:color="A6A6A6" w:sz="4"/>
-              <w:left w:val="single" w:color="A6A6A6" w:sz="4"/>
-              <w:bottom w:val="single" w:color="A6A6A6" w:sz="4"/>
-              <w:right w:val="single" w:color="A6A6A6" w:sz="4"/>
-            </w:tcBorders>
-            <w:tcMar>
-              <w:top w:type="dxa" w:w="60"/>
-              <w:left w:type="dxa" w:w="110"/>
-              <w:bottom w:type="dxa" w:w="60"/>
-              <w:right w:type="dxa" w:w="110"/>
-            </w:tcMar>
-            <w:vAlign w:val="center"/>
-          </w:tcPr>
-          <w:p>
-            <w:pPr>
-              <w:keepNext w:val="false"/>
-              <w:spacing w:after="0" w:line="252"/>
-            </w:pPr>
-            <w:r>
-              <w:rPr>
-                <w:highlight w:val="yellow"/>
-              </w:rPr>
-              <w:t xml:space="preserve">[month, year]</w:t>
-            </w:r>
-          </w:p>
-        </w:tc>
-      </w:tr>
-      <w:tr>
-        <w:trPr>
-          <w:cantSplit/>
-        </w:trPr>
-        <w:tc>
-          <w:tcPr>
-            <w:tcW w:type="dxa" w:w="600"/>
-            <w:tcBorders>
-              <w:top w:val="single" w:color="A6A6A6" w:sz="4"/>
-              <w:left w:val="single" w:color="A6A6A6" w:sz="4"/>
-              <w:bottom w:val="single" w:color="A6A6A6" w:sz="4"/>
-              <w:right w:val="single" w:color="A6A6A6" w:sz="4"/>
-            </w:tcBorders>
-            <w:shd w:fill="F2F4F8" w:color="auto" w:val="clear"/>
-            <w:tcMar>
-              <w:top w:type="dxa" w:w="60"/>
-              <w:left w:type="dxa" w:w="110"/>
-              <w:bottom w:type="dxa" w:w="60"/>
-              <w:right w:type="dxa" w:w="110"/>
-            </w:tcMar>
-            <w:vAlign w:val="center"/>
-          </w:tcPr>
-          <w:p>
-            <w:pPr>
-              <w:keepNext w:val="false"/>
-              <w:spacing w:after="0" w:line="252"/>
-            </w:pPr>
-            <w:r>
-              <w:t xml:space="preserve">2</w:t>
-            </w:r>
-          </w:p>
-        </w:tc>
-        <w:tc>
-          <w:tcPr>
-            <w:tcW w:type="dxa" w:w="4270"/>
-            <w:tcBorders>
-              <w:top w:val="single" w:color="A6A6A6" w:sz="4"/>
-              <w:left w:val="single" w:color="A6A6A6" w:sz="4"/>
-              <w:bottom w:val="single" w:color="A6A6A6" w:sz="4"/>
-              <w:right w:val="single" w:color="A6A6A6" w:sz="4"/>
-            </w:tcBorders>
-            <w:shd w:fill="F2F4F8" w:color="auto" w:val="clear"/>
-            <w:tcMar>
-              <w:top w:type="dxa" w:w="60"/>
-              <w:left w:type="dxa" w:w="110"/>
-              <w:bottom w:type="dxa" w:w="60"/>
-              <w:right w:type="dxa" w:w="110"/>
-            </w:tcMar>
-            <w:vAlign w:val="center"/>
-          </w:tcPr>
-          <w:p>
-            <w:pPr>
-              <w:keepNext w:val="false"/>
-              <w:spacing w:after="0" w:line="252"/>
-            </w:pPr>
-            <w:r>
-              <w:t xml:space="preserve">Preparation of a concept and technical proposal for </w:t>
-            </w:r>
-            <w:r>
-              <w:rPr>
-                <w:highlight w:val="yellow"/>
-              </w:rPr>
-              <w:t xml:space="preserve">[the modernisation of the Museum’s interactive science exhibition]</w:t>
-            </w:r>
-          </w:p>
-        </w:tc>
-        <w:tc>
-          <w:tcPr>
-            <w:tcW w:type="dxa" w:w="2200"/>
-            <w:tcBorders>
-              <w:top w:val="single" w:color="A6A6A6" w:sz="4"/>
-              <w:left w:val="single" w:color="A6A6A6" w:sz="4"/>
-              <w:bottom w:val="single" w:color="A6A6A6" w:sz="4"/>
-              <w:right w:val="single" w:color="A6A6A6" w:sz="4"/>
-            </w:tcBorders>
-            <w:shd w:fill="F2F4F8" w:color="auto" w:val="clear"/>
-            <w:tcMar>
-              <w:top w:type="dxa" w:w="60"/>
-              <w:left w:type="dxa" w:w="110"/>
-              <w:bottom w:type="dxa" w:w="60"/>
-              <w:right w:type="dxa" w:w="110"/>
-            </w:tcMar>
-            <w:vAlign w:val="center"/>
-          </w:tcPr>
-          <w:p>
-            <w:pPr>
-              <w:keepNext w:val="false"/>
-              <w:spacing w:after="0" w:line="252"/>
-            </w:pPr>
-            <w:r>
-              <w:t xml:space="preserve">Panshi</w:t>
-            </w:r>
-          </w:p>
-        </w:tc>
-        <w:tc>
-          <w:tcPr>
-            <w:tcW w:type="dxa" w:w="2000"/>
-            <w:tcBorders>
-              <w:top w:val="single" w:color="A6A6A6" w:sz="4"/>
-              <w:left w:val="single" w:color="A6A6A6" w:sz="4"/>
-              <w:bottom w:val="single" w:color="A6A6A6" w:sz="4"/>
-              <w:right w:val="single" w:color="A6A6A6" w:sz="4"/>
-            </w:tcBorders>
-            <w:shd w:fill="F2F4F8" w:color="auto" w:val="clear"/>
-            <w:tcMar>
-              <w:top w:type="dxa" w:w="60"/>
-              <w:left w:type="dxa" w:w="110"/>
-              <w:bottom w:type="dxa" w:w="60"/>
-              <w:right w:type="dxa" w:w="110"/>
-            </w:tcMar>
-            <w:vAlign w:val="center"/>
-          </w:tcPr>
-          <w:p>
-            <w:pPr>
-              <w:keepNext w:val="false"/>
-              <w:spacing w:after="0" w:line="252"/>
-            </w:pPr>
-            <w:r>
-              <w:rPr>
-                <w:highlight w:val="yellow"/>
-              </w:rPr>
-              <w:t xml:space="preserve">[__ weeks after the visit]</w:t>
-            </w:r>
-          </w:p>
-        </w:tc>
-      </w:tr>
-      <w:tr>
-        <w:trPr>
-          <w:cantSplit/>
-        </w:trPr>
-        <w:tc>
-          <w:tcPr>
-            <w:tcW w:type="dxa" w:w="600"/>
-            <w:tcBorders>
-              <w:top w:val="single" w:color="A6A6A6" w:sz="4"/>
-              <w:left w:val="single" w:color="A6A6A6" w:sz="4"/>
-              <w:bottom w:val="single" w:color="A6A6A6" w:sz="4"/>
-              <w:right w:val="single" w:color="A6A6A6" w:sz="4"/>
-            </w:tcBorders>
-            <w:tcMar>
-              <w:top w:type="dxa" w:w="60"/>
-              <w:left w:type="dxa" w:w="110"/>
-              <w:bottom w:type="dxa" w:w="60"/>
-              <w:right w:type="dxa" w:w="110"/>
-            </w:tcMar>
-            <w:vAlign w:val="center"/>
-          </w:tcPr>
-          <w:p>
-            <w:pPr>
-              <w:keepNext w:val="false"/>
-              <w:spacing w:after="0" w:line="252"/>
-            </w:pPr>
-            <w:r>
-              <w:t xml:space="preserve">3</w:t>
-            </w:r>
-          </w:p>
-        </w:tc>
-        <w:tc>
-          <w:tcPr>
-            <w:tcW w:type="dxa" w:w="4270"/>
-            <w:tcBorders>
-              <w:top w:val="single" w:color="A6A6A6" w:sz="4"/>
-              <w:left w:val="single" w:color="A6A6A6" w:sz="4"/>
-              <w:bottom w:val="single" w:color="A6A6A6" w:sz="4"/>
-              <w:right w:val="single" w:color="A6A6A6" w:sz="4"/>
-            </w:tcBorders>
-            <w:tcMar>
-              <w:top w:type="dxa" w:w="60"/>
-              <w:left w:type="dxa" w:w="110"/>
-              <w:bottom w:type="dxa" w:w="60"/>
-              <w:right w:type="dxa" w:w="110"/>
-            </w:tcMar>
-            <w:vAlign w:val="center"/>
-          </w:tcPr>
-          <w:p>
-            <w:pPr>
-              <w:keepNext w:val="false"/>
-              <w:spacing w:after="0" w:line="252"/>
-            </w:pPr>
-            <w:r>
-              <w:t xml:space="preserve">Study visit of Museum staff to Panshi’s production facilities and reference projects in China</w:t>
-            </w:r>
-          </w:p>
-        </w:tc>
-        <w:tc>
-          <w:tcPr>
-            <w:tcW w:type="dxa" w:w="2200"/>
-            <w:tcBorders>
-              <w:top w:val="single" w:color="A6A6A6" w:sz="4"/>
-              <w:left w:val="single" w:color="A6A6A6" w:sz="4"/>
-              <w:bottom w:val="single" w:color="A6A6A6" w:sz="4"/>
-              <w:right w:val="single" w:color="A6A6A6" w:sz="4"/>
-            </w:tcBorders>
-            <w:tcMar>
-              <w:top w:type="dxa" w:w="60"/>
-              <w:left w:type="dxa" w:w="110"/>
-              <w:bottom w:type="dxa" w:w="60"/>
-              <w:right w:type="dxa" w:w="110"/>
-            </w:tcMar>
-            <w:vAlign w:val="center"/>
-          </w:tcPr>
-          <w:p>
-            <w:pPr>
-              <w:keepNext w:val="false"/>
-              <w:spacing w:after="0" w:line="252"/>
-            </w:pPr>
-            <w:r>
-              <w:t xml:space="preserve">Both Parties</w:t>
-            </w:r>
-          </w:p>
-        </w:tc>
-        <w:tc>
-          <w:tcPr>
-            <w:tcW w:type="dxa" w:w="2000"/>
-            <w:tcBorders>
-              <w:top w:val="single" w:color="A6A6A6" w:sz="4"/>
-              <w:left w:val="single" w:color="A6A6A6" w:sz="4"/>
-              <w:bottom w:val="single" w:color="A6A6A6" w:sz="4"/>
-              <w:right w:val="single" w:color="A6A6A6" w:sz="4"/>
-            </w:tcBorders>
-            <w:tcMar>
-              <w:top w:type="dxa" w:w="60"/>
-              <w:left w:type="dxa" w:w="110"/>
-              <w:bottom w:type="dxa" w:w="60"/>
-              <w:right w:type="dxa" w:w="110"/>
-            </w:tcMar>
-            <w:vAlign w:val="center"/>
-          </w:tcPr>
-          <w:p>
-            <w:pPr>
-              <w:keepNext w:val="false"/>
-              <w:spacing w:after="0" w:line="252"/>
-            </w:pPr>
-            <w:r>
-              <w:rPr>
-                <w:highlight w:val="yellow"/>
-              </w:rPr>
-              <w:t xml:space="preserve">[month, year]</w:t>
-            </w:r>
-          </w:p>
-        </w:tc>
-      </w:tr>
-      <w:tr>
-        <w:trPr>
-          <w:cantSplit/>
-        </w:trPr>
-        <w:tc>
-          <w:tcPr>
-            <w:tcW w:type="dxa" w:w="600"/>
-            <w:tcBorders>
-              <w:top w:val="single" w:color="A6A6A6" w:sz="4"/>
-              <w:left w:val="single" w:color="A6A6A6" w:sz="4"/>
-              <w:bottom w:val="single" w:color="A6A6A6" w:sz="4"/>
-              <w:right w:val="single" w:color="A6A6A6" w:sz="4"/>
-            </w:tcBorders>
-            <w:shd w:fill="F2F4F8" w:color="auto" w:val="clear"/>
-            <w:tcMar>
-              <w:top w:type="dxa" w:w="60"/>
-              <w:left w:type="dxa" w:w="110"/>
-              <w:bottom w:type="dxa" w:w="60"/>
-              <w:right w:type="dxa" w:w="110"/>
-            </w:tcMar>
-            <w:vAlign w:val="center"/>
-          </w:tcPr>
-          <w:p>
-            <w:pPr>
-              <w:keepNext w:val="false"/>
-              <w:spacing w:after="0" w:line="252"/>
-            </w:pPr>
-            <w:r>
-              <w:t xml:space="preserve">4</w:t>
-            </w:r>
-          </w:p>
-        </w:tc>
-        <w:tc>
-          <w:tcPr>
-            <w:tcW w:type="dxa" w:w="4270"/>
-            <w:tcBorders>
-              <w:top w:val="single" w:color="A6A6A6" w:sz="4"/>
-              <w:left w:val="single" w:color="A6A6A6" w:sz="4"/>
-              <w:bottom w:val="single" w:color="A6A6A6" w:sz="4"/>
-              <w:right w:val="single" w:color="A6A6A6" w:sz="4"/>
-            </w:tcBorders>
-            <w:shd w:fill="F2F4F8" w:color="auto" w:val="clear"/>
-            <w:tcMar>
-              <w:top w:type="dxa" w:w="60"/>
-              <w:left w:type="dxa" w:w="110"/>
-              <w:bottom w:type="dxa" w:w="60"/>
-              <w:right w:type="dxa" w:w="110"/>
-            </w:tcMar>
-            <w:vAlign w:val="center"/>
-          </w:tcPr>
-          <w:p>
-            <w:pPr>
-              <w:keepNext w:val="false"/>
-              <w:spacing w:after="0" w:line="252"/>
-            </w:pPr>
-            <w:r>
-              <w:t xml:space="preserve">Training workshop for Museum staff on interactive exhibits and museum education</w:t>
-            </w:r>
-          </w:p>
-        </w:tc>
-        <w:tc>
-          <w:tcPr>
-            <w:tcW w:type="dxa" w:w="2200"/>
-            <w:tcBorders>
-              <w:top w:val="single" w:color="A6A6A6" w:sz="4"/>
-              <w:left w:val="single" w:color="A6A6A6" w:sz="4"/>
-              <w:bottom w:val="single" w:color="A6A6A6" w:sz="4"/>
-              <w:right w:val="single" w:color="A6A6A6" w:sz="4"/>
-            </w:tcBorders>
-            <w:shd w:fill="F2F4F8" w:color="auto" w:val="clear"/>
-            <w:tcMar>
-              <w:top w:type="dxa" w:w="60"/>
-              <w:left w:type="dxa" w:w="110"/>
-              <w:bottom w:type="dxa" w:w="60"/>
-              <w:right w:type="dxa" w:w="110"/>
-            </w:tcMar>
-            <w:vAlign w:val="center"/>
-          </w:tcPr>
-          <w:p>
-            <w:pPr>
-              <w:keepNext w:val="false"/>
-              <w:spacing w:after="0" w:line="252"/>
-            </w:pPr>
-            <w:r>
-              <w:t xml:space="preserve">Panshi</w:t>
-            </w:r>
-          </w:p>
-        </w:tc>
-        <w:tc>
-          <w:tcPr>
-            <w:tcW w:type="dxa" w:w="2000"/>
-            <w:tcBorders>
-              <w:top w:val="single" w:color="A6A6A6" w:sz="4"/>
-              <w:left w:val="single" w:color="A6A6A6" w:sz="4"/>
-              <w:bottom w:val="single" w:color="A6A6A6" w:sz="4"/>
-              <w:right w:val="single" w:color="A6A6A6" w:sz="4"/>
-            </w:tcBorders>
-            <w:shd w:fill="F2F4F8" w:color="auto" w:val="clear"/>
-            <w:tcMar>
-              <w:top w:type="dxa" w:w="60"/>
-              <w:left w:type="dxa" w:w="110"/>
-              <w:bottom w:type="dxa" w:w="60"/>
-              <w:right w:type="dxa" w:w="110"/>
-            </w:tcMar>
-            <w:vAlign w:val="center"/>
-          </w:tcPr>
-          <w:p>
-            <w:pPr>
-              <w:keepNext w:val="false"/>
-              <w:spacing w:after="0" w:line="252"/>
-            </w:pPr>
-            <w:r>
-              <w:rPr>
-                <w:highlight w:val="yellow"/>
-              </w:rPr>
-              <w:t xml:space="preserve">[month, year]</w:t>
-            </w:r>
-          </w:p>
-        </w:tc>
-      </w:tr>
-      <w:tr>
-        <w:trPr>
-          <w:cantSplit/>
-        </w:trPr>
-        <w:tc>
-          <w:tcPr>
-            <w:tcW w:type="dxa" w:w="600"/>
-            <w:tcBorders>
-              <w:top w:val="single" w:color="A6A6A6" w:sz="4"/>
-              <w:left w:val="single" w:color="A6A6A6" w:sz="4"/>
-              <w:bottom w:val="single" w:color="A6A6A6" w:sz="4"/>
-              <w:right w:val="single" w:color="A6A6A6" w:sz="4"/>
-            </w:tcBorders>
-            <w:tcMar>
-              <w:top w:type="dxa" w:w="60"/>
-              <w:left w:type="dxa" w:w="110"/>
-              <w:bottom w:type="dxa" w:w="60"/>
-              <w:right w:type="dxa" w:w="110"/>
-            </w:tcMar>
-            <w:vAlign w:val="center"/>
-          </w:tcPr>
-          <w:p>
-            <w:pPr>
-              <w:keepNext w:val="false"/>
-              <w:spacing w:after="0" w:line="252"/>
-            </w:pPr>
-            <w:r>
-              <w:t xml:space="preserve">5</w:t>
-            </w:r>
-          </w:p>
-        </w:tc>
-        <w:tc>
-          <w:tcPr>
-            <w:tcW w:type="dxa" w:w="4270"/>
-            <w:tcBorders>
-              <w:top w:val="single" w:color="A6A6A6" w:sz="4"/>
-              <w:left w:val="single" w:color="A6A6A6" w:sz="4"/>
-              <w:bottom w:val="single" w:color="A6A6A6" w:sz="4"/>
-              <w:right w:val="single" w:color="A6A6A6" w:sz="4"/>
-            </w:tcBorders>
-            <w:tcMar>
-              <w:top w:type="dxa" w:w="60"/>
-              <w:left w:type="dxa" w:w="110"/>
-              <w:bottom w:type="dxa" w:w="60"/>
-              <w:right w:type="dxa" w:w="110"/>
-            </w:tcMar>
-            <w:vAlign w:val="center"/>
-          </w:tcPr>
-          <w:p>
-            <w:pPr>
-              <w:keepNext w:val="false"/>
-              <w:spacing w:after="0" w:line="252"/>
-            </w:pPr>
-            <w:r>
-              <w:t xml:space="preserve">First meeting of the Joint Working Group; approval of the annual plan of activities</w:t>
-            </w:r>
-          </w:p>
-        </w:tc>
-        <w:tc>
-          <w:tcPr>
-            <w:tcW w:type="dxa" w:w="2200"/>
-            <w:tcBorders>
-              <w:top w:val="single" w:color="A6A6A6" w:sz="4"/>
-              <w:left w:val="single" w:color="A6A6A6" w:sz="4"/>
-              <w:bottom w:val="single" w:color="A6A6A6" w:sz="4"/>
-              <w:right w:val="single" w:color="A6A6A6" w:sz="4"/>
-            </w:tcBorders>
-            <w:tcMar>
-              <w:top w:type="dxa" w:w="60"/>
-              <w:left w:type="dxa" w:w="110"/>
-              <w:bottom w:type="dxa" w:w="60"/>
-              <w:right w:type="dxa" w:w="110"/>
-            </w:tcMar>
-            <w:vAlign w:val="center"/>
-          </w:tcPr>
-          <w:p>
-            <w:pPr>
-              <w:keepNext w:val="false"/>
-              <w:spacing w:after="0" w:line="252"/>
-            </w:pPr>
-            <w:r>
-              <w:t xml:space="preserve">Both Parties</w:t>
-            </w:r>
-          </w:p>
-        </w:tc>
-        <w:tc>
-          <w:tcPr>
-            <w:tcW w:type="dxa" w:w="2000"/>
-            <w:tcBorders>
-              <w:top w:val="single" w:color="A6A6A6" w:sz="4"/>
-              <w:left w:val="single" w:color="A6A6A6" w:sz="4"/>
-              <w:bottom w:val="single" w:color="A6A6A6" w:sz="4"/>
-              <w:right w:val="single" w:color="A6A6A6" w:sz="4"/>
-            </w:tcBorders>
-            <w:tcMar>
-              <w:top w:type="dxa" w:w="60"/>
-              <w:left w:type="dxa" w:w="110"/>
-              <w:bottom w:type="dxa" w:w="60"/>
-              <w:right w:type="dxa" w:w="110"/>
-            </w:tcMar>
-            <w:vAlign w:val="center"/>
-          </w:tcPr>
-          <w:p>
-            <w:pPr>
-              <w:keepNext w:val="false"/>
-              <w:spacing w:after="0" w:line="252"/>
-            </w:pPr>
-            <w:r>
-              <w:rPr>
-                <w:highlight w:val="yellow"/>
-              </w:rPr>
-              <w:t xml:space="preserve">[month, year]</w:t>
             </w:r>
           </w:p>
         </w:tc>

</xml_diff>

<commit_message>
Date the MoU 30 October 2026 and remove seal placeholders
Co-Authored-By: Claude Opus 5.5 <noreply@anthropic.com>
Claude-Session: https://claude.ai/code/session_01Lu4QoaDikGyrPsvsHy5NF8
</commit_message>
<xml_diff>
--- a/memorandum/MoU_Tashkent_Polytechnic_Museum_Panshi_DRAFT.docx
+++ b/memorandum/MoU_Tashkent_Polytechnic_Museum_Panshi_DRAFT.docx
@@ -120,10 +120,7 @@
         <w:t xml:space="preserve">	</w:t>
       </w:r>
       <w:r>
-        <w:rPr>
-          <w:highlight w:val="yellow"/>
-        </w:rPr>
-        <w:t xml:space="preserve">[__ ____________ 2026]</w:t>
+        <w:t xml:space="preserve">30 October 2026</w:t>
       </w:r>
     </w:p>
     <w:p>
@@ -2058,28 +2055,7 @@
               <w:spacing w:after="0" w:line="252"/>
             </w:pPr>
             <w:r>
-              <w:t xml:space="preserve">Date: </w:t>
-            </w:r>
-            <w:r>
-              <w:rPr>
-                <w:highlight w:val="yellow"/>
-              </w:rPr>
-              <w:t xml:space="preserve">[__ / __ / 2026]</w:t>
-            </w:r>
-          </w:p>
-          <w:p>
-            <w:pPr>
-              <w:keepNext w:val="false"/>
-              <w:spacing w:after="0" w:line="252"/>
-            </w:pPr>
-          </w:p>
-          <w:p>
-            <w:pPr>
-              <w:keepNext w:val="false"/>
-              <w:spacing w:after="0" w:line="252"/>
-            </w:pPr>
-            <w:r>
-              <w:t xml:space="preserve">L.S.</w:t>
+              <w:t xml:space="preserve">Date: 30 October 2026</w:t>
             </w:r>
           </w:p>
         </w:tc>
@@ -2185,28 +2161,7 @@
               <w:spacing w:after="0" w:line="252"/>
             </w:pPr>
             <w:r>
-              <w:t xml:space="preserve">Date: </w:t>
-            </w:r>
-            <w:r>
-              <w:rPr>
-                <w:highlight w:val="yellow"/>
-              </w:rPr>
-              <w:t xml:space="preserve">[__ / __ / 2026]</w:t>
-            </w:r>
-          </w:p>
-          <w:p>
-            <w:pPr>
-              <w:keepNext w:val="false"/>
-              <w:spacing w:after="0" w:line="252"/>
-            </w:pPr>
-          </w:p>
-          <w:p>
-            <w:pPr>
-              <w:keepNext w:val="false"/>
-              <w:spacing w:after="0" w:line="252"/>
-            </w:pPr>
-            <w:r>
-              <w:t xml:space="preserve">L.S.</w:t>
+              <w:t xml:space="preserve">Date: 30 October 2026</w:t>
             </w:r>
           </w:p>
         </w:tc>

</xml_diff>